<commit_message>
Iteracja: TRÓJKA Bo5 Wygr.+ramki, DWÓJKA Bo3 ramki, DWÓJKA Bo5 Godz./bold, IND Bo7 header=wyniki, CZWÓRKA swap
</commit_message>
<xml_diff>
--- a/CZWÓRKA_Bo5.docx
+++ b/CZWÓRKA_Bo5.docx
@@ -678,7 +678,16 @@
                 <w:sz w:val="20"/>
                 <w:szCs w:val="20"/>
               </w:rPr>
-              <w:t xml:space="preserve">Każda drużyna zaczyna po jednym secie (w dowolnej kolejności). </w:t>
+              <w:t>Sety 1-4 rozpoczynamy na zmianę</w:t>
+            </w:r>
+            <w:r>
+              <w:rPr>
+                <w:rFonts w:ascii="Aptos Narrow" w:hAnsi="Aptos Narrow" w:eastAsia="Aptos Narrow" w:cs="Aptos Narrow"/>
+                <w:color w:val="000000" w:themeColor="text1" w:themeTint="FF" w:themeShade="FF"/>
+                <w:sz w:val="20"/>
+                <w:szCs w:val="20"/>
+              </w:rPr>
+              <w:t xml:space="preserve">. </w:t>
             </w:r>
             <w:r>
               <w:rPr>
@@ -748,7 +757,27 @@
                 <w:szCs w:val="20"/>
                 <w:lang w:val="pl"/>
               </w:rPr>
-              <w:t>.seta zaczyna osoba z większą liczbą punktów</w:t>
+              <w:t xml:space="preserve">.seta zaczyna </w:t>
+            </w:r>
+            <w:r>
+              <w:rPr>
+                <w:rFonts w:ascii="Aptos Narrow" w:hAnsi="Aptos Narrow" w:eastAsia="Aptos Narrow" w:cs="Aptos Narrow"/>
+                <w:color w:val="000000" w:themeColor="text1" w:themeTint="FF" w:themeShade="FF"/>
+                <w:sz w:val="20"/>
+                <w:szCs w:val="20"/>
+                <w:lang w:val="pl"/>
+              </w:rPr>
+              <w:t>drużyn</w:t>
+            </w:r>
+            <w:r>
+              <w:rPr>
+                <w:rFonts w:ascii="Aptos Narrow" w:hAnsi="Aptos Narrow" w:eastAsia="Aptos Narrow" w:cs="Aptos Narrow"/>
+                <w:color w:val="000000" w:themeColor="text1" w:themeTint="FF" w:themeShade="FF"/>
+                <w:sz w:val="20"/>
+                <w:szCs w:val="20"/>
+                <w:lang w:val="pl"/>
+              </w:rPr>
+              <w:t>a z większą liczbą punktów</w:t>
             </w:r>
             <w:r>
               <w:rPr>
@@ -17113,6 +17142,9 @@
           </w:tcPr>
           <w:p>
             <w:pPr>
+              <w:pStyle w:val="Normal"/>
+              <w:suppressLineNumbers w:val="0"/>
+              <w:bidi w:val="0"/>
               <w:jc w:val="right"/>
               <w:rPr>
                 <w:rFonts w:ascii="Aptos" w:hAnsi="Aptos" w:eastAsia="Aptos" w:cs="Aptos"/>
@@ -17127,7 +17159,7 @@
                 <w:sz w:val="20"/>
                 <w:szCs w:val="20"/>
               </w:rPr>
-              <w:t xml:space="preserve">Każda drużyna zaczyna po jednym secie (w dowolnej kolejności). </w:t>
+              <w:t xml:space="preserve">Sety 1-4 rozpoczynamy na zmianę. </w:t>
             </w:r>
             <w:r>
               <w:rPr>
@@ -17137,17 +17169,7 @@
                 <w:szCs w:val="20"/>
                 <w:lang w:val="pl"/>
               </w:rPr>
-              <w:t xml:space="preserve">Przy wyniku </w:t>
-            </w:r>
-            <w:r>
-              <w:rPr>
-                <w:rFonts w:ascii="Aptos Narrow" w:hAnsi="Aptos Narrow" w:eastAsia="Aptos Narrow" w:cs="Aptos Narrow"/>
-                <w:color w:val="000000" w:themeColor="text1" w:themeTint="FF" w:themeShade="FF"/>
-                <w:sz w:val="20"/>
-                <w:szCs w:val="20"/>
-                <w:lang w:val="pl"/>
-              </w:rPr>
-              <w:t>2</w:t>
+              <w:t>Przy wyniku 2</w:t>
             </w:r>
             <w:r>
               <w:rPr>
@@ -17167,37 +17189,7 @@
                 <w:szCs w:val="20"/>
                 <w:lang w:val="pl"/>
               </w:rPr>
-              <w:t>2</w:t>
-            </w:r>
-            <w:r>
-              <w:rPr>
-                <w:rFonts w:ascii="Aptos Narrow" w:hAnsi="Aptos Narrow" w:eastAsia="Aptos Narrow" w:cs="Aptos Narrow"/>
-                <w:color w:val="000000" w:themeColor="text1" w:themeTint="FF" w:themeShade="FF"/>
-                <w:sz w:val="20"/>
-                <w:szCs w:val="20"/>
-                <w:lang w:val="pl"/>
-              </w:rPr>
-              <w:t xml:space="preserve"> w setach, </w:t>
-            </w:r>
-            <w:r>
-              <w:rPr>
-                <w:rFonts w:ascii="Aptos Narrow" w:hAnsi="Aptos Narrow" w:eastAsia="Aptos Narrow" w:cs="Aptos Narrow"/>
-                <w:color w:val="000000" w:themeColor="text1" w:themeTint="FF" w:themeShade="FF"/>
-                <w:sz w:val="20"/>
-                <w:szCs w:val="20"/>
-                <w:lang w:val="pl"/>
-              </w:rPr>
-              <w:t>5</w:t>
-            </w:r>
-            <w:r>
-              <w:rPr>
-                <w:rFonts w:ascii="Aptos Narrow" w:hAnsi="Aptos Narrow" w:eastAsia="Aptos Narrow" w:cs="Aptos Narrow"/>
-                <w:color w:val="000000" w:themeColor="text1" w:themeTint="FF" w:themeShade="FF"/>
-                <w:sz w:val="20"/>
-                <w:szCs w:val="20"/>
-                <w:lang w:val="pl"/>
-              </w:rPr>
-              <w:t>.seta zaczyna osoba z większą liczbą punktów</w:t>
+              <w:t>2 w setach, 5.seta zaczyna osoba z większą liczbą punktów</w:t>
             </w:r>
             <w:r>
               <w:rPr>

</xml_diff>